<commit_message>
📝 docs: sync resume.json and M2sResumeWord.txt with updated Word doc
</commit_message>
<xml_diff>
--- a/documents/M2sAI3ResumeWord.docx
+++ b/documents/M2sAI3ResumeWord.docx
@@ -27,7 +27,49 @@
         <w:rPr>
           <w:sz w:val="18"/>
         </w:rPr>
-        <w:t xml:space="preserve">818 Scott Street, Covington, KY 41011 • 859-750-1953 • m2web@yahoo.com markmcfadden.net • m2.fyi • linkedin.com/in/m2web/ </w:t>
+        <w:t xml:space="preserve">818 Scott Street, Covington, KY 41011 • 859-750-1953 • </w:t>
+      </w:r>
+      <w:r>
+        <w:rPr>
+          <w:sz w:val="18"/>
+        </w:rPr>
+        <w:t xml:space="preserve">ai@markmcfadden.net </w:t>
+      </w:r>
+      <w:r>
+        <w:rPr>
+          <w:sz w:val="18"/>
+        </w:rPr>
+        <w:t>•</w:t>
+      </w:r>
+      <w:r>
+        <w:rPr>
+          <w:sz w:val="18"/>
+        </w:rPr>
+        <w:t xml:space="preserve"> </w:t>
+      </w:r>
+      <w:r>
+        <w:rPr>
+          <w:sz w:val="18"/>
+        </w:rPr>
+        <w:t>https://</w:t>
+      </w:r>
+      <w:r>
+        <w:rPr>
+          <w:sz w:val="18"/>
+        </w:rPr>
+        <w:t xml:space="preserve">markmcfadden.net • </w:t>
+      </w:r>
+      <w:r>
+        <w:rPr>
+          <w:sz w:val="18"/>
+        </w:rPr>
+        <w:t>https://</w:t>
+      </w:r>
+      <w:r>
+        <w:rPr>
+          <w:sz w:val="18"/>
+        </w:rPr>
+        <w:t xml:space="preserve">m2.fyi • linkedin.com/in/m2web/ </w:t>
       </w:r>
     </w:p>
     <w:p>
@@ -374,12 +416,6 @@
         <w:tblStyle w:val="TableGrid"/>
         <w:tblW w:w="9591" w:type="dxa"/>
         <w:tblInd w:w="0" w:type="dxa"/>
-        <w:tblCellMar>
-          <w:top w:w="0" w:type="dxa"/>
-          <w:left w:w="0" w:type="dxa"/>
-          <w:bottom w:w="0" w:type="dxa"/>
-          <w:right w:w="0" w:type="dxa"/>
-        </w:tblCellMar>
         <w:tblLook w:val="04A0" w:firstRow="1" w:lastRow="0" w:firstColumn="1" w:lastColumn="0" w:noHBand="0" w:noVBand="1"/>
       </w:tblPr>
       <w:tblGrid>
@@ -3262,6 +3298,29 @@
       </w:tblCellMar>
     </w:tblPr>
   </w:style>
+  <w:style w:type="character" w:styleId="Hyperlink">
+    <w:name w:val="Hyperlink"/>
+    <w:basedOn w:val="DefaultParagraphFont"/>
+    <w:uiPriority w:val="99"/>
+    <w:unhideWhenUsed/>
+    <w:rsid w:val="00EF71BC"/>
+    <w:rPr>
+      <w:color w:val="0563C1" w:themeColor="hyperlink"/>
+      <w:u w:val="single"/>
+    </w:rPr>
+  </w:style>
+  <w:style w:type="character" w:styleId="UnresolvedMention">
+    <w:name w:val="Unresolved Mention"/>
+    <w:basedOn w:val="DefaultParagraphFont"/>
+    <w:uiPriority w:val="99"/>
+    <w:semiHidden/>
+    <w:unhideWhenUsed/>
+    <w:rsid w:val="00EF71BC"/>
+    <w:rPr>
+      <w:color w:val="605E5C"/>
+      <w:shd w:val="clear" w:color="auto" w:fill="E1DFDD"/>
+    </w:rPr>
+  </w:style>
 </w:styles>
 </file>
 

</xml_diff>

<commit_message>
📝 Updated Word Resume and PDF
</commit_message>
<xml_diff>
--- a/documents/M2sAI3ResumeWord.docx
+++ b/documents/M2sAI3ResumeWord.docx
@@ -33,31 +33,37 @@
         <w:rPr>
           <w:sz w:val="18"/>
         </w:rPr>
-        <w:t xml:space="preserve">ai@markmcfadden.net </w:t>
+        <w:t>ai@markmcfadden.net •</w:t>
       </w:r>
       <w:r>
         <w:rPr>
           <w:sz w:val="18"/>
         </w:rPr>
-        <w:t>•</w:t>
+        <w:t xml:space="preserve"> </w:t>
       </w:r>
       <w:r>
         <w:rPr>
           <w:sz w:val="18"/>
         </w:rPr>
-        <w:t xml:space="preserve"> </w:t>
+        <w:t>https://</w:t>
       </w:r>
       <w:r>
         <w:rPr>
           <w:sz w:val="18"/>
         </w:rPr>
+        <w:t xml:space="preserve">markmcfadden.net • </w:t>
+      </w:r>
+      <w:r>
+        <w:rPr>
+          <w:sz w:val="18"/>
+        </w:rPr>
         <w:t>https://</w:t>
       </w:r>
       <w:r>
         <w:rPr>
           <w:sz w:val="18"/>
         </w:rPr>
-        <w:t xml:space="preserve">markmcfadden.net • </w:t>
+        <w:t xml:space="preserve">m2.fyi • </w:t>
       </w:r>
       <w:r>
         <w:rPr>
@@ -69,7 +75,7 @@
         <w:rPr>
           <w:sz w:val="18"/>
         </w:rPr>
-        <w:t xml:space="preserve">m2.fyi • linkedin.com/in/m2web/ </w:t>
+        <w:t xml:space="preserve">linkedin.com/in/m2web/ </w:t>
       </w:r>
     </w:p>
     <w:p>
@@ -1055,7 +1061,13 @@
         <w:ind w:hanging="126"/>
       </w:pPr>
       <w:r>
-        <w:t>Instructor for Graduate Level Information Technology Governance.</w:t>
+        <w:t xml:space="preserve">Instructor for </w:t>
+      </w:r>
+      <w:r>
+        <w:t>Graduate-Level</w:t>
+      </w:r>
+      <w:r>
+        <w:t xml:space="preserve"> Information Technology Governance.</w:t>
       </w:r>
     </w:p>
     <w:p>
@@ -1148,15 +1160,7 @@
         <w:ind w:hanging="126"/>
       </w:pPr>
       <w:r>
-        <w:t xml:space="preserve">Utilized Automated Testing Applications such as </w:t>
-      </w:r>
-      <w:proofErr w:type="spellStart"/>
-      <w:r>
-        <w:t>NUnit</w:t>
-      </w:r>
-      <w:proofErr w:type="spellEnd"/>
-      <w:r>
-        <w:t xml:space="preserve"> for Test Driven Development.</w:t>
+        <w:t>Utilized Automated Testing Applications such as NUnit for Test Driven Development.</w:t>
       </w:r>
     </w:p>
     <w:p>

</xml_diff>